<commit_message>
docs: Update execution guide with RealSense D455F camera settings
</commit_message>
<xml_diff>
--- a/EXECUTION_GUIDE.docx
+++ b/EXECUTION_GUIDE.docx
@@ -2046,6 +2046,966 @@
           <w:rStyle w:val="StringTok"/>
         </w:rPr>
         <w:t xml:space="preserve">"{pos: [0.0, 0.0, 0.0, 0.0, 0.0, 0.0], vel: 30.0, acc: 30.0}"</w:t>
+      </w:r>
+    </w:p>
+    <w:p>
+      <w:r>
+        <w:pict>
+          <v:rect style="width:0;height:1.5pt" o:hralign="center" o:hrstd="t" o:hr="t"/>
+        </w:pict>
+      </w:r>
+    </w:p>
+    <w:p>
+      <w:pPr>
+        <w:pStyle w:val="Heading2"/>
+      </w:pPr>
+      <w:bookmarkStart w:id="41" w:name="X67b7c78d21dee0a90b14e52d4ee4d7add4a30db"/>
+      <w:r>
+        <w:t xml:space="preserve">9. RealSense D455F 뎁스 카메라 설정 및 비전 처리 최적화 (Advanced Vision Guide)</w:t>
+      </w:r>
+      <w:bookmarkEnd w:id="41"/>
+    </w:p>
+    <w:p>
+      <w:pPr>
+        <w:pStyle w:val="FirstParagraph"/>
+      </w:pPr>
+      <w:r>
+        <w:t xml:space="preserve">물체가 겹쳐 있고 난반사가 심한 편의점 매대 정리 환경에서 RealSense D455F(IR Pass-through 필터 적용 모델)를 사용하기 위해 드라이버 설정과 비전 처리 파이프라인의 핵심 정합성을 점검해야 합니다.</w:t>
+      </w:r>
+    </w:p>
+    <w:p>
+      <w:pPr>
+        <w:pStyle w:val="Heading3"/>
+      </w:pPr>
+      <w:bookmarkStart w:id="42" w:name="realsense-sdk-및-ros2-wrapper-핵심-실행-인자"/>
+      <w:r>
+        <w:t xml:space="preserve">① RealSense SDK 및 ROS2 Wrapper 핵심 실행 인자</w:t>
+      </w:r>
+      <w:bookmarkEnd w:id="42"/>
+    </w:p>
+    <w:p>
+      <w:pPr>
+        <w:pStyle w:val="FirstParagraph"/>
+      </w:pPr>
+      <w:r>
+        <w:t xml:space="preserve">물리 카메라 노드를 기동할 때 반드시</w:t>
+      </w:r>
+      <w:r>
+        <w:t xml:space="preserve"> </w:t>
+      </w:r>
+      <w:r>
+        <w:rPr>
+          <w:b/>
+        </w:rPr>
+        <w:t xml:space="preserve">뎁스 이미지-컬러 이미지 픽셀 정합(Depth Alignment)</w:t>
+      </w:r>
+      <w:r>
+        <w:t xml:space="preserve">과</w:t>
+      </w:r>
+      <w:r>
+        <w:t xml:space="preserve"> </w:t>
+      </w:r>
+      <w:r>
+        <w:rPr>
+          <w:b/>
+        </w:rPr>
+        <w:t xml:space="preserve">적외선 프로젝터(Laser Emitter)</w:t>
+      </w:r>
+      <w:r>
+        <w:t xml:space="preserve">를 활성화해야 합니다.</w:t>
+      </w:r>
+    </w:p>
+    <w:p>
+      <w:pPr>
+        <w:pStyle w:val="SourceCode"/>
+      </w:pPr>
+      <w:r>
+        <w:rPr>
+          <w:rStyle w:val="CommentTok"/>
+        </w:rPr>
+        <w:t xml:space="preserve"># 뎁스-컬러 정합 및 프로젝터를 활성화하여 realsense2_camera 구동</w:t>
+      </w:r>
+      <w:r>
+        <w:br/>
+      </w:r>
+      <w:r>
+        <w:rPr>
+          <w:rStyle w:val="ExtensionTok"/>
+        </w:rPr>
+        <w:t xml:space="preserve">ros2</w:t>
+      </w:r>
+      <w:r>
+        <w:rPr>
+          <w:rStyle w:val="NormalTok"/>
+        </w:rPr>
+        <w:t xml:space="preserve"> launch realsense2_camera rs_launch.py </w:t>
+      </w:r>
+      <w:r>
+        <w:rPr>
+          <w:rStyle w:val="KeywordTok"/>
+        </w:rPr>
+        <w:t xml:space="preserve">\</w:t>
+      </w:r>
+      <w:r>
+        <w:br/>
+      </w:r>
+      <w:r>
+        <w:rPr>
+          <w:rStyle w:val="NormalTok"/>
+        </w:rPr>
+        <w:t xml:space="preserve">    </w:t>
+      </w:r>
+      <w:r>
+        <w:rPr>
+          <w:rStyle w:val="ExtensionTok"/>
+        </w:rPr>
+        <w:t xml:space="preserve">align_depth.enable</w:t>
+      </w:r>
+      <w:r>
+        <w:rPr>
+          <w:rStyle w:val="NormalTok"/>
+        </w:rPr>
+        <w:t xml:space="preserve">:=true </w:t>
+      </w:r>
+      <w:r>
+        <w:rPr>
+          <w:rStyle w:val="KeywordTok"/>
+        </w:rPr>
+        <w:t xml:space="preserve">\</w:t>
+      </w:r>
+      <w:r>
+        <w:br/>
+      </w:r>
+      <w:r>
+        <w:rPr>
+          <w:rStyle w:val="NormalTok"/>
+        </w:rPr>
+        <w:t xml:space="preserve">    </w:t>
+      </w:r>
+      <w:r>
+        <w:rPr>
+          <w:rStyle w:val="ExtensionTok"/>
+        </w:rPr>
+        <w:t xml:space="preserve">depth_module.emitter_enabled</w:t>
+      </w:r>
+      <w:r>
+        <w:rPr>
+          <w:rStyle w:val="NormalTok"/>
+        </w:rPr>
+        <w:t xml:space="preserve">:=1 </w:t>
+      </w:r>
+      <w:r>
+        <w:rPr>
+          <w:rStyle w:val="KeywordTok"/>
+        </w:rPr>
+        <w:t xml:space="preserve">\</w:t>
+      </w:r>
+      <w:r>
+        <w:br/>
+      </w:r>
+      <w:r>
+        <w:rPr>
+          <w:rStyle w:val="NormalTok"/>
+        </w:rPr>
+        <w:t xml:space="preserve">    </w:t>
+      </w:r>
+      <w:r>
+        <w:rPr>
+          <w:rStyle w:val="ExtensionTok"/>
+        </w:rPr>
+        <w:t xml:space="preserve">depth_module.profile</w:t>
+      </w:r>
+      <w:r>
+        <w:rPr>
+          <w:rStyle w:val="NormalTok"/>
+        </w:rPr>
+        <w:t xml:space="preserve">:=640x480x30 </w:t>
+      </w:r>
+      <w:r>
+        <w:rPr>
+          <w:rStyle w:val="KeywordTok"/>
+        </w:rPr>
+        <w:t xml:space="preserve">\</w:t>
+      </w:r>
+      <w:r>
+        <w:br/>
+      </w:r>
+      <w:r>
+        <w:rPr>
+          <w:rStyle w:val="NormalTok"/>
+        </w:rPr>
+        <w:t xml:space="preserve">    </w:t>
+      </w:r>
+      <w:r>
+        <w:rPr>
+          <w:rStyle w:val="ExtensionTok"/>
+        </w:rPr>
+        <w:t xml:space="preserve">rgb_camera.profile</w:t>
+      </w:r>
+      <w:r>
+        <w:rPr>
+          <w:rStyle w:val="NormalTok"/>
+        </w:rPr>
+        <w:t xml:space="preserve">:=640x480x30</w:t>
+      </w:r>
+    </w:p>
+    <w:p>
+      <w:pPr>
+        <w:numPr>
+          <w:ilvl w:val="0"/>
+          <w:numId w:val="1020"/>
+        </w:numPr>
+        <w:pStyle w:val="Compact"/>
+      </w:pPr>
+      <w:r>
+        <w:rPr>
+          <w:rStyle w:val="VerbatimChar"/>
+          <w:b/>
+        </w:rPr>
+        <w:t xml:space="preserve">align_depth.enable:=true</w:t>
+      </w:r>
+      <w:r>
+        <w:rPr>
+          <w:b/>
+        </w:rPr>
+        <w:t xml:space="preserve"> </w:t>
+      </w:r>
+      <w:r>
+        <w:rPr>
+          <w:b/>
+        </w:rPr>
+        <w:t xml:space="preserve">(필수)</w:t>
+      </w:r>
+      <w:r>
+        <w:t xml:space="preserve">: 이 옵션을 활성화해야 컬러 렌즈 프레임 기준의 정합된 뎁스 맵 토픽(</w:t>
+      </w:r>
+      <w:r>
+        <w:rPr>
+          <w:rStyle w:val="VerbatimChar"/>
+        </w:rPr>
+        <w:t xml:space="preserve">/camera/aligned_depth_to_color/image_raw</w:t>
+      </w:r>
+      <w:r>
+        <w:t xml:space="preserve">)이 발행됩니다.</w:t>
+      </w:r>
+    </w:p>
+    <w:p>
+      <w:pPr>
+        <w:numPr>
+          <w:ilvl w:val="0"/>
+          <w:numId w:val="1020"/>
+        </w:numPr>
+        <w:pStyle w:val="Compact"/>
+      </w:pPr>
+      <w:r>
+        <w:rPr>
+          <w:rStyle w:val="VerbatimChar"/>
+          <w:b/>
+        </w:rPr>
+        <w:t xml:space="preserve">depth_module.emitter_enabled:=1</w:t>
+      </w:r>
+      <w:r>
+        <w:t xml:space="preserve">: 텍스처가 부족한 매대 선반이나 단색 포장지 표면에 인공 적외선 도트 패턴을 투사하여 뎁스 홀(Depth Hole, 노이즈) 발생을 억제합니다.</w:t>
+      </w:r>
+    </w:p>
+    <w:p>
+      <w:pPr>
+        <w:pStyle w:val="Heading3"/>
+      </w:pPr>
+      <w:bookmarkStart w:id="43" w:name="비전-노드-토픽-정합성-수정-sim-to-real-크리티컬-버그-예방"/>
+      <w:r>
+        <w:t xml:space="preserve">② 비전 노드 토픽 정합성 수정 (Sim-to-Real 크리티컬 버그 예방)</w:t>
+      </w:r>
+      <w:bookmarkEnd w:id="43"/>
+    </w:p>
+    <w:p>
+      <w:pPr>
+        <w:pStyle w:val="FirstParagraph"/>
+      </w:pPr>
+      <w:r>
+        <w:t xml:space="preserve">YOLO-seg 기반의 바운딩 박스와 세그멘테이션 마스크는 컬러 이미지(</w:t>
+      </w:r>
+      <w:r>
+        <w:rPr>
+          <w:rStyle w:val="VerbatimChar"/>
+        </w:rPr>
+        <w:t xml:space="preserve">/camera/color/image_raw</w:t>
+      </w:r>
+      <w:r>
+        <w:t xml:space="preserve">)를 기준으로 생성됩니다. 만약 정합되지 않은 생 뎁스 이미지(</w:t>
+      </w:r>
+      <w:r>
+        <w:rPr>
+          <w:rStyle w:val="VerbatimChar"/>
+        </w:rPr>
+        <w:t xml:space="preserve">/camera/depth/image_rect_raw</w:t>
+      </w:r>
+      <w:r>
+        <w:t xml:space="preserve">)에서 깊이 값을 샘플링할 경우, 두 렌즈 간의 물리적 오프셋(Baseline) 때문에 완전히 다른 3D 좌표를 얻게 됩니다.</w:t>
+      </w:r>
+    </w:p>
+    <w:p>
+      <w:pPr>
+        <w:pStyle w:val="BodyText"/>
+      </w:pPr>
+      <w:r>
+        <w:t xml:space="preserve">따라서 3D 좌표 추정 및 포인트클라우드 빌드 노드들이 구독하는 뎁스 토픽을 다음과 같이 변경해야 합니다.</w:t>
+      </w:r>
+    </w:p>
+    <w:p>
+      <w:pPr>
+        <w:numPr>
+          <w:ilvl w:val="0"/>
+          <w:numId w:val="1021"/>
+        </w:numPr>
+      </w:pPr>
+      <w:r>
+        <w:rPr>
+          <w:b/>
+        </w:rPr>
+        <w:t xml:space="preserve">수정 대상 파일</w:t>
+      </w:r>
+      <w:r>
+        <w:t xml:space="preserve">:</w:t>
+      </w:r>
+    </w:p>
+    <w:p>
+      <w:pPr>
+        <w:numPr>
+          <w:ilvl w:val="1"/>
+          <w:numId w:val="1022"/>
+        </w:numPr>
+        <w:pStyle w:val="Compact"/>
+      </w:pPr>
+      <w:r>
+        <w:rPr>
+          <w:rStyle w:val="VerbatimChar"/>
+        </w:rPr>
+        <w:t xml:space="preserve">src/custom/vision/pose_estimation_node.py</w:t>
+      </w:r>
+    </w:p>
+    <w:p>
+      <w:pPr>
+        <w:numPr>
+          <w:ilvl w:val="1"/>
+          <w:numId w:val="1022"/>
+        </w:numPr>
+        <w:pStyle w:val="Compact"/>
+      </w:pPr>
+      <w:r>
+        <w:rPr>
+          <w:rStyle w:val="VerbatimChar"/>
+        </w:rPr>
+        <w:t xml:space="preserve">src/custom/vision/pointcloud_node.py</w:t>
+      </w:r>
+    </w:p>
+    <w:p>
+      <w:pPr>
+        <w:numPr>
+          <w:ilvl w:val="0"/>
+          <w:numId w:val="1021"/>
+        </w:numPr>
+      </w:pPr>
+      <w:r>
+        <w:rPr>
+          <w:b/>
+        </w:rPr>
+        <w:t xml:space="preserve">수정 내역 (구독 토픽 변경)</w:t>
+      </w:r>
+      <w:r>
+        <w:t xml:space="preserve">:</w:t>
+      </w:r>
+    </w:p>
+    <w:p>
+      <w:pPr>
+        <w:numPr>
+          <w:ilvl w:val="0"/>
+          <w:numId w:val="1000"/>
+        </w:numPr>
+        <w:pStyle w:val="SourceCode"/>
+      </w:pPr>
+      <w:r>
+        <w:rPr>
+          <w:rStyle w:val="CommentTok"/>
+        </w:rPr>
+        <w:t xml:space="preserve"># 기존 코드</w:t>
+      </w:r>
+      <w:r>
+        <w:br/>
+      </w:r>
+      <w:r>
+        <w:rPr>
+          <w:rStyle w:val="VariableTok"/>
+        </w:rPr>
+        <w:t xml:space="preserve">self</w:t>
+      </w:r>
+      <w:r>
+        <w:rPr>
+          <w:rStyle w:val="NormalTok"/>
+        </w:rPr>
+        <w:t xml:space="preserve">.sub_depth </w:t>
+      </w:r>
+      <w:r>
+        <w:rPr>
+          <w:rStyle w:val="OperatorTok"/>
+        </w:rPr>
+        <w:t xml:space="preserve">=</w:t>
+      </w:r>
+      <w:r>
+        <w:rPr>
+          <w:rStyle w:val="NormalTok"/>
+        </w:rPr>
+        <w:t xml:space="preserve"> </w:t>
+      </w:r>
+      <w:r>
+        <w:rPr>
+          <w:rStyle w:val="VariableTok"/>
+        </w:rPr>
+        <w:t xml:space="preserve">self</w:t>
+      </w:r>
+      <w:r>
+        <w:rPr>
+          <w:rStyle w:val="NormalTok"/>
+        </w:rPr>
+        <w:t xml:space="preserve">.create_subscription(</w:t>
+      </w:r>
+      <w:r>
+        <w:br/>
+      </w:r>
+      <w:r>
+        <w:rPr>
+          <w:rStyle w:val="NormalTok"/>
+        </w:rPr>
+        <w:t xml:space="preserve">    Image, </w:t>
+      </w:r>
+      <w:r>
+        <w:rPr>
+          <w:rStyle w:val="StringTok"/>
+        </w:rPr>
+        <w:t xml:space="preserve">'/camera/depth/image_rect_raw'</w:t>
+      </w:r>
+      <w:r>
+        <w:rPr>
+          <w:rStyle w:val="NormalTok"/>
+        </w:rPr>
+        <w:t xml:space="preserve">, </w:t>
+      </w:r>
+      <w:r>
+        <w:rPr>
+          <w:rStyle w:val="VariableTok"/>
+        </w:rPr>
+        <w:t xml:space="preserve">self</w:t>
+      </w:r>
+      <w:r>
+        <w:rPr>
+          <w:rStyle w:val="NormalTok"/>
+        </w:rPr>
+        <w:t xml:space="preserve">.depth_callback, </w:t>
+      </w:r>
+      <w:r>
+        <w:rPr>
+          <w:rStyle w:val="DecValTok"/>
+        </w:rPr>
+        <w:t xml:space="preserve">10</w:t>
+      </w:r>
+      <w:r>
+        <w:rPr>
+          <w:rStyle w:val="NormalTok"/>
+        </w:rPr>
+        <w:t xml:space="preserve">)</w:t>
+      </w:r>
+      <w:r>
+        <w:br/>
+      </w:r>
+      <w:r>
+        <w:br/>
+      </w:r>
+      <w:r>
+        <w:rPr>
+          <w:rStyle w:val="CommentTok"/>
+        </w:rPr>
+        <w:t xml:space="preserve"># 변경 코드 (aligned depth 토픽 적용)</w:t>
+      </w:r>
+      <w:r>
+        <w:br/>
+      </w:r>
+      <w:r>
+        <w:rPr>
+          <w:rStyle w:val="VariableTok"/>
+        </w:rPr>
+        <w:t xml:space="preserve">self</w:t>
+      </w:r>
+      <w:r>
+        <w:rPr>
+          <w:rStyle w:val="NormalTok"/>
+        </w:rPr>
+        <w:t xml:space="preserve">.sub_depth </w:t>
+      </w:r>
+      <w:r>
+        <w:rPr>
+          <w:rStyle w:val="OperatorTok"/>
+        </w:rPr>
+        <w:t xml:space="preserve">=</w:t>
+      </w:r>
+      <w:r>
+        <w:rPr>
+          <w:rStyle w:val="NormalTok"/>
+        </w:rPr>
+        <w:t xml:space="preserve"> </w:t>
+      </w:r>
+      <w:r>
+        <w:rPr>
+          <w:rStyle w:val="VariableTok"/>
+        </w:rPr>
+        <w:t xml:space="preserve">self</w:t>
+      </w:r>
+      <w:r>
+        <w:rPr>
+          <w:rStyle w:val="NormalTok"/>
+        </w:rPr>
+        <w:t xml:space="preserve">.create_subscription(</w:t>
+      </w:r>
+      <w:r>
+        <w:br/>
+      </w:r>
+      <w:r>
+        <w:rPr>
+          <w:rStyle w:val="NormalTok"/>
+        </w:rPr>
+        <w:t xml:space="preserve">    Image, </w:t>
+      </w:r>
+      <w:r>
+        <w:rPr>
+          <w:rStyle w:val="StringTok"/>
+        </w:rPr>
+        <w:t xml:space="preserve">'/camera/aligned_depth_to_color/image_raw'</w:t>
+      </w:r>
+      <w:r>
+        <w:rPr>
+          <w:rStyle w:val="NormalTok"/>
+        </w:rPr>
+        <w:t xml:space="preserve">, </w:t>
+      </w:r>
+      <w:r>
+        <w:rPr>
+          <w:rStyle w:val="VariableTok"/>
+        </w:rPr>
+        <w:t xml:space="preserve">self</w:t>
+      </w:r>
+      <w:r>
+        <w:rPr>
+          <w:rStyle w:val="NormalTok"/>
+        </w:rPr>
+        <w:t xml:space="preserve">.depth_callback, </w:t>
+      </w:r>
+      <w:r>
+        <w:rPr>
+          <w:rStyle w:val="DecValTok"/>
+        </w:rPr>
+        <w:t xml:space="preserve">10</w:t>
+      </w:r>
+      <w:r>
+        <w:rPr>
+          <w:rStyle w:val="NormalTok"/>
+        </w:rPr>
+        <w:t xml:space="preserve">)</w:t>
+      </w:r>
+    </w:p>
+    <w:p>
+      <w:pPr>
+        <w:pStyle w:val="Heading3"/>
+      </w:pPr>
+      <w:bookmarkStart w:id="44" w:name="카메라-내부-파라미터camera-intrinsics-동적-획득"/>
+      <w:r>
+        <w:t xml:space="preserve">③ 카메라 내부 파라미터(Camera Intrinsics) 동적 획득</w:t>
+      </w:r>
+      <w:bookmarkEnd w:id="44"/>
+    </w:p>
+    <w:p>
+      <w:pPr>
+        <w:pStyle w:val="FirstParagraph"/>
+      </w:pPr>
+      <w:r>
+        <w:rPr>
+          <w:rStyle w:val="VerbatimChar"/>
+        </w:rPr>
+        <w:t xml:space="preserve">pointcloud_node.py</w:t>
+      </w:r>
+      <w:r>
+        <w:t xml:space="preserve">에 하드코딩된 내부 파라미터(</w:t>
+      </w:r>
+      <w:r>
+        <w:rPr>
+          <w:rStyle w:val="VerbatimChar"/>
+        </w:rPr>
+        <w:t xml:space="preserve">CAMERA_FX = 615.0</w:t>
+      </w:r>
+      <w:r>
+        <w:t xml:space="preserve"> </w:t>
+      </w:r>
+      <w:r>
+        <w:t xml:space="preserve">등)는 캘리브레이션 오차의 원인이 됩니다.</w:t>
+      </w:r>
+      <w:r>
+        <w:t xml:space="preserve"> </w:t>
+      </w:r>
+      <w:r>
+        <w:rPr>
+          <w:rStyle w:val="VerbatimChar"/>
+        </w:rPr>
+        <w:t xml:space="preserve">pose_estimation_node.py</w:t>
+      </w:r>
+      <w:r>
+        <w:t xml:space="preserve">와 같이 다음과 같이</w:t>
+      </w:r>
+      <w:r>
+        <w:t xml:space="preserve"> </w:t>
+      </w:r>
+      <w:r>
+        <w:rPr>
+          <w:rStyle w:val="VerbatimChar"/>
+        </w:rPr>
+        <w:t xml:space="preserve">/camera/depth/camera_info</w:t>
+      </w:r>
+      <w:r>
+        <w:t xml:space="preserve"> </w:t>
+      </w:r>
+      <w:r>
+        <w:t xml:space="preserve">토픽을 구독하여 카메라 해상도 및 초점 거리를 실시간으로 매핑하도록 기능을 수정 및 보완하는 것이 권장됩니다.</w:t>
+      </w:r>
+    </w:p>
+    <w:p>
+      <w:pPr>
+        <w:pStyle w:val="SourceCode"/>
+      </w:pPr>
+      <w:r>
+        <w:rPr>
+          <w:rStyle w:val="CommentTok"/>
+        </w:rPr>
+        <w:t xml:space="preserve"># camera_info 구독 추가 예시</w:t>
+      </w:r>
+      <w:r>
+        <w:br/>
+      </w:r>
+      <w:r>
+        <w:rPr>
+          <w:rStyle w:val="VariableTok"/>
+        </w:rPr>
+        <w:t xml:space="preserve">self</w:t>
+      </w:r>
+      <w:r>
+        <w:rPr>
+          <w:rStyle w:val="NormalTok"/>
+        </w:rPr>
+        <w:t xml:space="preserve">.sub_cam_info </w:t>
+      </w:r>
+      <w:r>
+        <w:rPr>
+          <w:rStyle w:val="OperatorTok"/>
+        </w:rPr>
+        <w:t xml:space="preserve">=</w:t>
+      </w:r>
+      <w:r>
+        <w:rPr>
+          <w:rStyle w:val="NormalTok"/>
+        </w:rPr>
+        <w:t xml:space="preserve"> </w:t>
+      </w:r>
+      <w:r>
+        <w:rPr>
+          <w:rStyle w:val="VariableTok"/>
+        </w:rPr>
+        <w:t xml:space="preserve">self</w:t>
+      </w:r>
+      <w:r>
+        <w:rPr>
+          <w:rStyle w:val="NormalTok"/>
+        </w:rPr>
+        <w:t xml:space="preserve">.create_subscription(</w:t>
+      </w:r>
+      <w:r>
+        <w:br/>
+      </w:r>
+      <w:r>
+        <w:rPr>
+          <w:rStyle w:val="NormalTok"/>
+        </w:rPr>
+        <w:t xml:space="preserve">    CameraInfo, </w:t>
+      </w:r>
+      <w:r>
+        <w:rPr>
+          <w:rStyle w:val="StringTok"/>
+        </w:rPr>
+        <w:t xml:space="preserve">'/camera/depth/camera_info'</w:t>
+      </w:r>
+      <w:r>
+        <w:rPr>
+          <w:rStyle w:val="NormalTok"/>
+        </w:rPr>
+        <w:t xml:space="preserve">, </w:t>
+      </w:r>
+      <w:r>
+        <w:rPr>
+          <w:rStyle w:val="VariableTok"/>
+        </w:rPr>
+        <w:t xml:space="preserve">self</w:t>
+      </w:r>
+      <w:r>
+        <w:rPr>
+          <w:rStyle w:val="NormalTok"/>
+        </w:rPr>
+        <w:t xml:space="preserve">.camera_info_callback, </w:t>
+      </w:r>
+      <w:r>
+        <w:rPr>
+          <w:rStyle w:val="DecValTok"/>
+        </w:rPr>
+        <w:t xml:space="preserve">10</w:t>
+      </w:r>
+      <w:r>
+        <w:rPr>
+          <w:rStyle w:val="NormalTok"/>
+        </w:rPr>
+        <w:t xml:space="preserve">)</w:t>
+      </w:r>
+      <w:r>
+        <w:br/>
+      </w:r>
+      <w:r>
+        <w:br/>
+      </w:r>
+      <w:r>
+        <w:rPr>
+          <w:rStyle w:val="KeywordTok"/>
+        </w:rPr>
+        <w:t xml:space="preserve">def</w:t>
+      </w:r>
+      <w:r>
+        <w:rPr>
+          <w:rStyle w:val="NormalTok"/>
+        </w:rPr>
+        <w:t xml:space="preserve"> camera_info_callback(</w:t>
+      </w:r>
+      <w:r>
+        <w:rPr>
+          <w:rStyle w:val="VariableTok"/>
+        </w:rPr>
+        <w:t xml:space="preserve">self</w:t>
+      </w:r>
+      <w:r>
+        <w:rPr>
+          <w:rStyle w:val="NormalTok"/>
+        </w:rPr>
+        <w:t xml:space="preserve">, msg):</w:t>
+      </w:r>
+      <w:r>
+        <w:br/>
+      </w:r>
+      <w:r>
+        <w:rPr>
+          <w:rStyle w:val="NormalTok"/>
+        </w:rPr>
+        <w:t xml:space="preserve">    </w:t>
+      </w:r>
+      <w:r>
+        <w:rPr>
+          <w:rStyle w:val="VariableTok"/>
+        </w:rPr>
+        <w:t xml:space="preserve">self</w:t>
+      </w:r>
+      <w:r>
+        <w:rPr>
+          <w:rStyle w:val="NormalTok"/>
+        </w:rPr>
+        <w:t xml:space="preserve">.fx, </w:t>
+      </w:r>
+      <w:r>
+        <w:rPr>
+          <w:rStyle w:val="VariableTok"/>
+        </w:rPr>
+        <w:t xml:space="preserve">self</w:t>
+      </w:r>
+      <w:r>
+        <w:rPr>
+          <w:rStyle w:val="NormalTok"/>
+        </w:rPr>
+        <w:t xml:space="preserve">.fy </w:t>
+      </w:r>
+      <w:r>
+        <w:rPr>
+          <w:rStyle w:val="OperatorTok"/>
+        </w:rPr>
+        <w:t xml:space="preserve">=</w:t>
+      </w:r>
+      <w:r>
+        <w:rPr>
+          <w:rStyle w:val="NormalTok"/>
+        </w:rPr>
+        <w:t xml:space="preserve"> msg.k[</w:t>
+      </w:r>
+      <w:r>
+        <w:rPr>
+          <w:rStyle w:val="DecValTok"/>
+        </w:rPr>
+        <w:t xml:space="preserve">0</w:t>
+      </w:r>
+      <w:r>
+        <w:rPr>
+          <w:rStyle w:val="NormalTok"/>
+        </w:rPr>
+        <w:t xml:space="preserve">], msg.k[</w:t>
+      </w:r>
+      <w:r>
+        <w:rPr>
+          <w:rStyle w:val="DecValTok"/>
+        </w:rPr>
+        <w:t xml:space="preserve">4</w:t>
+      </w:r>
+      <w:r>
+        <w:rPr>
+          <w:rStyle w:val="NormalTok"/>
+        </w:rPr>
+        <w:t xml:space="preserve">]</w:t>
+      </w:r>
+      <w:r>
+        <w:br/>
+      </w:r>
+      <w:r>
+        <w:rPr>
+          <w:rStyle w:val="NormalTok"/>
+        </w:rPr>
+        <w:t xml:space="preserve">    </w:t>
+      </w:r>
+      <w:r>
+        <w:rPr>
+          <w:rStyle w:val="VariableTok"/>
+        </w:rPr>
+        <w:t xml:space="preserve">self</w:t>
+      </w:r>
+      <w:r>
+        <w:rPr>
+          <w:rStyle w:val="NormalTok"/>
+        </w:rPr>
+        <w:t xml:space="preserve">.cx, </w:t>
+      </w:r>
+      <w:r>
+        <w:rPr>
+          <w:rStyle w:val="VariableTok"/>
+        </w:rPr>
+        <w:t xml:space="preserve">self</w:t>
+      </w:r>
+      <w:r>
+        <w:rPr>
+          <w:rStyle w:val="NormalTok"/>
+        </w:rPr>
+        <w:t xml:space="preserve">.cy </w:t>
+      </w:r>
+      <w:r>
+        <w:rPr>
+          <w:rStyle w:val="OperatorTok"/>
+        </w:rPr>
+        <w:t xml:space="preserve">=</w:t>
+      </w:r>
+      <w:r>
+        <w:rPr>
+          <w:rStyle w:val="NormalTok"/>
+        </w:rPr>
+        <w:t xml:space="preserve"> msg.k[</w:t>
+      </w:r>
+      <w:r>
+        <w:rPr>
+          <w:rStyle w:val="DecValTok"/>
+        </w:rPr>
+        <w:t xml:space="preserve">2</w:t>
+      </w:r>
+      <w:r>
+        <w:rPr>
+          <w:rStyle w:val="NormalTok"/>
+        </w:rPr>
+        <w:t xml:space="preserve">], msg.k[</w:t>
+      </w:r>
+      <w:r>
+        <w:rPr>
+          <w:rStyle w:val="DecValTok"/>
+        </w:rPr>
+        <w:t xml:space="preserve">5</w:t>
+      </w:r>
+      <w:r>
+        <w:rPr>
+          <w:rStyle w:val="NormalTok"/>
+        </w:rPr>
+        <w:t xml:space="preserve">]</w:t>
+      </w:r>
+    </w:p>
+    <w:p>
+      <w:pPr>
+        <w:pStyle w:val="Heading3"/>
+      </w:pPr>
+      <w:bookmarkStart w:id="45" w:name="조명-및-환경-변화에-따른-realsense-튜닝-팁"/>
+      <w:r>
+        <w:t xml:space="preserve">④ 조명 및 환경 변화에 따른 RealSense 튜닝 팁</w:t>
+      </w:r>
+      <w:bookmarkEnd w:id="45"/>
+    </w:p>
+    <w:p>
+      <w:pPr>
+        <w:pStyle w:val="FirstParagraph"/>
+      </w:pPr>
+      <w:r>
+        <w:t xml:space="preserve">실시간 환경에서 편의점 매대의 밝기나 재질에 따라 노이즈가 심할 경우, 아래 동적 파라미터 재설정을 통해 뎁스 데이터 품질을 최적화할 수 있습니다.</w:t>
+      </w:r>
+    </w:p>
+    <w:p>
+      <w:pPr>
+        <w:pStyle w:val="SourceCode"/>
+      </w:pPr>
+      <w:r>
+        <w:rPr>
+          <w:rStyle w:val="CommentTok"/>
+        </w:rPr>
+        <w:t xml:space="preserve"># 레이저 프로젝터 강도 최대화 (기본값: 150)</w:t>
+      </w:r>
+      <w:r>
+        <w:br/>
+      </w:r>
+      <w:r>
+        <w:rPr>
+          <w:rStyle w:val="ExtensionTok"/>
+        </w:rPr>
+        <w:t xml:space="preserve">ros2</w:t>
+      </w:r>
+      <w:r>
+        <w:rPr>
+          <w:rStyle w:val="NormalTok"/>
+        </w:rPr>
+        <w:t xml:space="preserve"> param set /camera/camera depth_module.laser_power 360</w:t>
+      </w:r>
+      <w:r>
+        <w:br/>
+      </w:r>
+      <w:r>
+        <w:br/>
+      </w:r>
+      <w:r>
+        <w:rPr>
+          <w:rStyle w:val="CommentTok"/>
+        </w:rPr>
+        <w:t xml:space="preserve"># 자동 노출 활성화</w:t>
+      </w:r>
+      <w:r>
+        <w:br/>
+      </w:r>
+      <w:r>
+        <w:rPr>
+          <w:rStyle w:val="ExtensionTok"/>
+        </w:rPr>
+        <w:t xml:space="preserve">ros2</w:t>
+      </w:r>
+      <w:r>
+        <w:rPr>
+          <w:rStyle w:val="NormalTok"/>
+        </w:rPr>
+        <w:t xml:space="preserve"> param set /camera/camera depth_module.enable_auto_exposure true</w:t>
       </w:r>
     </w:p>
     <w:sectPr/>
@@ -2563,6 +3523,42 @@
   </w:num>
   <w:num w:numId="1019">
     <w:abstractNumId w:val="991"/>
+  </w:num>
+  <w:num w:numId="1020">
+    <w:abstractNumId w:val="991"/>
+  </w:num>
+  <w:num w:numId="1021">
+    <w:abstractNumId w:val="991"/>
+  </w:num>
+  <w:num w:numId="1022">
+    <w:abstractNumId w:val="99411"/>
+    <w:lvlOverride w:ilvl="0">
+      <w:startOverride w:val="1"/>
+    </w:lvlOverride>
+    <w:lvlOverride w:ilvl="1">
+      <w:startOverride w:val="1"/>
+    </w:lvlOverride>
+    <w:lvlOverride w:ilvl="2">
+      <w:startOverride w:val="1"/>
+    </w:lvlOverride>
+    <w:lvlOverride w:ilvl="3">
+      <w:startOverride w:val="1"/>
+    </w:lvlOverride>
+    <w:lvlOverride w:ilvl="4">
+      <w:startOverride w:val="1"/>
+    </w:lvlOverride>
+    <w:lvlOverride w:ilvl="5">
+      <w:startOverride w:val="1"/>
+    </w:lvlOverride>
+    <w:lvlOverride w:ilvl="6">
+      <w:startOverride w:val="1"/>
+    </w:lvlOverride>
+    <w:lvlOverride w:ilvl="7">
+      <w:startOverride w:val="1"/>
+    </w:lvlOverride>
+    <w:lvlOverride w:ilvl="8">
+      <w:startOverride w:val="1"/>
+    </w:lvlOverride>
   </w:num>
 </w:numbering>
 </file>

</xml_diff>